<commit_message>
fix(templates, fire): the posted sheet 5.2 lists the detection and alarm installations under alarm, the extinguishing ones under point II.2 ("Nu este cazul" without any) and the emergency lighting of the escape routes under evacuation, from `alarmInstallations`, `extinguishingInstallations` and `hasEmergencyLighting`; the schedules 5.4 print the activity in lower case from `activityRunOn`; the annual report 7.2 closes the state of the documents with `documentsSummary`; decision 4 gives its acknowledgement two empty rows like the other decisions; the manifest notes say so and 7.2 keeps the title line the merge data changes
</commit_message>
<xml_diff>
--- a/packages/document-engine/templates/fire/1.4_fire_decision_smoking.docx
+++ b/packages/document-engine/templates/fire/1.4_fire_decision_smoking.docx
@@ -1581,6 +1581,201 @@
                 <w:lang w:val="ro-RO"/>
               </w:rPr>
               <w:t>{{issueDate}}{{/fire.designated}}</w:t>
+            </w:r>
+          </w:p>
+        </w:tc>
+        <w:tc>
+          <w:tcPr>
+            <w:tcW w:w="1903" w:type="dxa"/>
+            <w:tcBorders>
+              <w:top w:val="single" w:sz="4" w:space="0" w:color="000000"/>
+              <w:left w:val="single" w:sz="4" w:space="0" w:color="000000"/>
+              <w:bottom w:val="single" w:sz="4" w:space="0" w:color="000000"/>
+              <w:right w:val="single" w:sz="4" w:space="0" w:color="000000"/>
+            </w:tcBorders>
+          </w:tcPr>
+          <w:p>
+            <w:pPr>
+              <w:pStyle w:val="Normal"/>
+              <w:widowControl/>
+              <w:snapToGrid w:val="false"/>
+              <w:spacing w:before="0" w:after="0"/>
+              <w:rPr>
+                <w:rFonts w:ascii="Arial" w:hAnsi="Arial" w:cs="Arial"/>
+                <w:sz w:val="20"/>
+                <w:szCs w:val="20"/>
+              </w:rPr>
+            </w:pPr>
+            <w:r>
+              <w:rPr>
+                <w:rFonts w:eastAsia="Arial" w:cs="Arial" w:ascii="Arial" w:hAnsi="Arial"/>
+                <w:color w:val="auto"/>
+                <w:spacing w:val="0"/>
+                <w:w w:val="100"/>
+                <w:sz w:val="20"/>
+                <w:szCs w:val="20"/>
+                <w:lang w:val="ro-RO"/>
+              </w:rPr>
+            </w:r>
+          </w:p>
+        </w:tc>
+      </w:tr>
+      <w:tr>
+        <w:trPr>
+          <w:trHeight w:val="290" w:hRule="atLeast"/>
+        </w:trPr>
+        <w:tc>
+          <w:tcPr>
+            <w:tcW w:w="620" w:type="dxa"/>
+            <w:tcBorders>
+              <w:top w:val="single" w:sz="4" w:space="0" w:color="000000"/>
+              <w:left w:val="single" w:sz="4" w:space="0" w:color="000000"/>
+              <w:bottom w:val="single" w:sz="4" w:space="0" w:color="000000"/>
+              <w:right w:val="single" w:sz="4" w:space="0" w:color="000000"/>
+            </w:tcBorders>
+            <w:vAlign w:val="center"/>
+          </w:tcPr>
+          <w:p>
+            <w:pPr>
+              <w:pStyle w:val="Normal"/>
+              <w:keepNext w:val="true"/>
+              <w:widowControl/>
+              <w:numPr>
+                <w:ilvl w:val="0"/>
+                <w:numId w:val="2"/>
+              </w:numPr>
+              <w:snapToGrid w:val="false"/>
+              <w:spacing w:before="0" w:after="0"/>
+              <w:ind w:hanging="360" w:left="360" w:right="-108"/>
+              <w:jc w:val="center"/>
+              <w:rPr>
+                <w:rFonts w:ascii="Arial" w:hAnsi="Arial" w:cs="Arial"/>
+                <w:b/>
+                <w:sz w:val="20"/>
+                <w:szCs w:val="20"/>
+              </w:rPr>
+            </w:pPr>
+            <w:r>
+              <w:rPr>
+                <w:rFonts w:eastAsia="Arial" w:cs="Arial" w:ascii="Arial" w:hAnsi="Arial"/>
+                <w:b/>
+                <w:color w:val="auto"/>
+                <w:spacing w:val="0"/>
+                <w:w w:val="100"/>
+                <w:sz w:val="20"/>
+                <w:szCs w:val="20"/>
+                <w:lang w:val="ro-RO"/>
+              </w:rPr>
+            </w:r>
+          </w:p>
+        </w:tc>
+        <w:tc>
+          <w:tcPr>
+            <w:tcW w:w="3459" w:type="dxa"/>
+            <w:tcBorders>
+              <w:top w:val="single" w:sz="4" w:space="0" w:color="000000"/>
+              <w:left w:val="single" w:sz="4" w:space="0" w:color="000000"/>
+              <w:bottom w:val="single" w:sz="4" w:space="0" w:color="000000"/>
+              <w:right w:val="single" w:sz="4" w:space="0" w:color="000000"/>
+            </w:tcBorders>
+            <w:vAlign w:val="center"/>
+          </w:tcPr>
+          <w:p>
+            <w:pPr>
+              <w:pStyle w:val="Normal"/>
+              <w:widowControl/>
+              <w:snapToGrid w:val="false"/>
+              <w:spacing w:before="0" w:after="0"/>
+              <w:rPr>
+                <w:rFonts w:ascii="Arial" w:hAnsi="Arial" w:cs="Arial"/>
+                <w:sz w:val="20"/>
+                <w:szCs w:val="20"/>
+              </w:rPr>
+            </w:pPr>
+            <w:r>
+              <w:rPr>
+                <w:rFonts w:eastAsia="Arial" w:cs="Arial" w:ascii="Arial" w:hAnsi="Arial"/>
+                <w:color w:val="auto"/>
+                <w:spacing w:val="0"/>
+                <w:w w:val="100"/>
+                <w:sz w:val="20"/>
+                <w:szCs w:val="20"/>
+                <w:lang w:val="ro-RO"/>
+              </w:rPr>
+            </w:r>
+          </w:p>
+        </w:tc>
+        <w:tc>
+          <w:tcPr>
+            <w:tcW w:w="2075" w:type="dxa"/>
+            <w:tcBorders>
+              <w:top w:val="single" w:sz="4" w:space="0" w:color="000000"/>
+              <w:left w:val="single" w:sz="4" w:space="0" w:color="000000"/>
+              <w:bottom w:val="single" w:sz="4" w:space="0" w:color="000000"/>
+              <w:right w:val="single" w:sz="4" w:space="0" w:color="000000"/>
+            </w:tcBorders>
+            <w:vAlign w:val="center"/>
+          </w:tcPr>
+          <w:p>
+            <w:pPr>
+              <w:pStyle w:val="Normal"/>
+              <w:widowControl/>
+              <w:snapToGrid w:val="false"/>
+              <w:spacing w:before="0" w:after="0"/>
+              <w:jc w:val="center"/>
+              <w:rPr>
+                <w:rFonts w:ascii="Arial" w:hAnsi="Arial" w:cs="Arial"/>
+                <w:sz w:val="20"/>
+                <w:szCs w:val="20"/>
+              </w:rPr>
+            </w:pPr>
+            <w:r>
+              <w:rPr>
+                <w:rFonts w:eastAsia="Arial" w:cs="Arial" w:ascii="Arial" w:hAnsi="Arial"/>
+                <w:color w:val="auto"/>
+                <w:spacing w:val="0"/>
+                <w:w w:val="100"/>
+                <w:sz w:val="20"/>
+                <w:szCs w:val="20"/>
+                <w:lang w:val="ro-RO"/>
+              </w:rPr>
+            </w:r>
+          </w:p>
+        </w:tc>
+        <w:tc>
+          <w:tcPr>
+            <w:tcW w:w="1298" w:type="dxa"/>
+            <w:tcBorders>
+              <w:top w:val="single" w:sz="4" w:space="0" w:color="000000"/>
+              <w:left w:val="single" w:sz="4" w:space="0" w:color="000000"/>
+              <w:bottom w:val="single" w:sz="4" w:space="0" w:color="000000"/>
+              <w:right w:val="single" w:sz="4" w:space="0" w:color="000000"/>
+            </w:tcBorders>
+            <w:vAlign w:val="center"/>
+          </w:tcPr>
+          <w:p>
+            <w:pPr>
+              <w:pStyle w:val="Normal"/>
+              <w:widowControl/>
+              <w:snapToGrid w:val="false"/>
+              <w:spacing w:before="0" w:after="0"/>
+              <w:jc w:val="center"/>
+              <w:rPr>
+                <w:rFonts w:ascii="Arial" w:hAnsi="Arial" w:cs="Arial"/>
+                <w:sz w:val="20"/>
+                <w:szCs w:val="20"/>
+              </w:rPr>
+            </w:pPr>
+            <w:r>
+              <w:rPr>
+                <w:rFonts w:eastAsia="Arial" w:cs="Arial" w:ascii="Arial" w:hAnsi="Arial"/>
+                <w:color w:val="auto"/>
+                <w:spacing w:val="0"/>
+                <w:w w:val="100"/>
+                <w:sz w:val="20"/>
+                <w:szCs w:val="20"/>
+                <w:lang w:val="ro-RO"/>
+              </w:rPr>
             </w:r>
           </w:p>
         </w:tc>

</xml_diff>